<commit_message>
final edits to Chapter 6: Siblings Round Two
</commit_message>
<xml_diff>
--- a/6 - Siblings Round Two.docx
+++ b/6 - Siblings Round Two.docx
@@ -5,7 +5,7 @@
   <w:body>
     <w:p>
       <w:pPr>
-        <w:pStyle w:val="Heading1"/>
+        <w:pStyle w:val="Heading2"/>
       </w:pPr>
       <w:bookmarkStart w:id="0" w:name="_Toc234028655"/>
       <w:bookmarkStart w:id="1" w:name="_Toc234078193"/>
@@ -53,10 +53,10 @@
           <w:i/>
           <w:iCs/>
         </w:rPr>
-        <w:t>maybe tickle her with his feathers</w:t>
-      </w:r>
-      <w:r>
-        <w:t>, but quickly discards that idea. His whole body lights up thinking he could get her and Kaya would take the blame. Jack hops to her back and hooks his front left claw into her belt loop and starts to tug at it. Lea lets out a low growl and swats in his general direction. He tries again, careful not to let her feel the sharpness of his talons and this time takes a hop back. Lea growls, “Stop it Kaya!” and swats at him again missing. Jack hops forward for a third try when he barely moves out of Lea’s way as she rolls over to face him. She grabs the blanket and wraps it back around her upper body, placing her back against the wall of the cavern. He sees her feet are still exposed.</w:t>
+        <w:t>maybe tickle her with his feathers,</w:t>
+      </w:r>
+      <w:r>
+        <w:t xml:space="preserve"> but quickly discards that idea. His whole body lights up thinking he could get her and Kaya would take the blame. Jack hops to her back and hooks his front left claw into her belt loop and starts to tug at it. Lea lets out a low growl and swats in his general direction. He tries again, careful not to let her feel the sharpness of his talons and this time takes a hop back. Lea growls, “Stop it Kaya!” and swats at him again missing. Jack hops forward for a third try when he barely moves out of Lea’s way as she rolls over to face him. She grabs the blanket and wraps it back around her upper body, placing her back against the wall of the cavern. He sees her feet are still exposed.</w:t>
       </w:r>
     </w:p>
     <w:p>
@@ -69,164 +69,87 @@
           <w:i/>
           <w:iCs/>
         </w:rPr>
-        <w:t>O</w:t>
-      </w:r>
+        <w:t xml:space="preserve">Okay, I can’t pull on her pants legs, and I can try to get a sock off, but… wait, she’s ticklish. Oh, this gonna be </w:t>
+      </w:r>
+      <w:proofErr w:type="spellStart"/>
       <w:r>
         <w:rPr>
           <w:i/>
           <w:iCs/>
         </w:rPr>
-        <w:t>kay, I can’t pull on her pants legs, and I can try to get a sock off, but…</w:t>
-      </w:r>
+        <w:t>soooo</w:t>
+      </w:r>
+      <w:proofErr w:type="spellEnd"/>
       <w:r>
         <w:rPr>
           <w:i/>
           <w:iCs/>
         </w:rPr>
-        <w:t xml:space="preserve"> </w:t>
-      </w:r>
+        <w:t xml:space="preserve"> good,</w:t>
+      </w:r>
+      <w:r>
+        <w:t xml:space="preserve"> he thinks to himself.</w:t>
+      </w:r>
+    </w:p>
+    <w:p>
       <w:r>
         <w:rPr>
           <w:i/>
           <w:iCs/>
         </w:rPr>
-        <w:t>wait</w:t>
+        <w:t xml:space="preserve">Talon or beak? Beak. </w:t>
+      </w:r>
+      <w:r>
+        <w:t>Jack nods to himself with the decision and looks around her curled up legs to verify she is still asleep. He judges the distance and takes a small hop forward. He stretches his neck out so just the tip of his beak reaches the soles of her feet and quickly runs his beak up one and down the other, and then jumps back. Nothing. Not even a twitch. Socks are too thick. He walks slowly forward again and freezes midstep when he hears Kaya sloshing as she dog-paddles toward the cavern again. He has to move quickly before she returns. He takes a big hop and inches from Lea’s feet, when he runs the tip of his beak up the middle of the sole of her foot. He quietly thanks heaven these were not wool socks, which would snag his beak. Just as quickly, he runs his beak in the same maneuver, down her other sole just as Kaya enters the mouth of the cavern, water up to her belly, dripping and beginning to shake herself dry.</w:t>
+      </w:r>
+    </w:p>
+    <w:p>
+      <w:r>
+        <w:t xml:space="preserve">Lea is just settling back to sleep but still alert, making sure Kaya is not rummaging through the saddle bags for the last of her supplies since the market won’t be open today. She knows it’s probably late and she needs to get up but dozes back to sleep thinking, </w:t>
       </w:r>
       <w:r>
         <w:rPr>
           <w:i/>
           <w:iCs/>
         </w:rPr>
-        <w:t>,</w:t>
+        <w:t>Ten minutes more won’t hurt.</w:t>
+      </w:r>
+      <w:r>
+        <w:t xml:space="preserve"> She feels something tug at her sock slightly but thinks she’s dreaming and settles back down. She is almost completely relaxed again when something runs up one sole of her foot and down the other in a move her father loved to perform on her to make her squeal and jump. Before it hits her fully what is happening, her body reacts and she kicks violently in the direction of whomever might be at her feet.</w:t>
+      </w:r>
+    </w:p>
+    <w:p>
+      <w:r>
+        <w:t xml:space="preserve">Jack is unprepared for her reaction. He has forgotten that Lea can kick like an army mule and he suddenly has one foot squarely in his chest, launching him toward the mouth of the cavern. He lands and bounces just near the spring and realizes he is about to collide with Kaya. She lowers her ears and growls at him, </w:t>
+      </w:r>
+      <w:proofErr w:type="gramStart"/>
+      <w:r>
+        <w:t>baring</w:t>
+      </w:r>
+      <w:proofErr w:type="gramEnd"/>
+      <w:r>
+        <w:t xml:space="preserve"> teeth. He has nowhere to go but right in them. He unfolds his wings and fans his tail hoping to create the flaps airplanes use to slow down. Jack lands between her front feet. Kaya looks down at him and out comes the sly grin again. He’s up to his neck in water and realizes he will have to change or drown to avoid what punishment Kaya is about to dole out. Kaya takes her front paw and flicks him to her back foot where he’s now struggling to stay above water. Kaya takes her back paw and dunks him the rest of the way under the water. Jack sputters and tries not to let the water fill his lungs as he slowly starts sliding on the slick limestone of the cavern entrance to the drop off to the bottom of the lake. Kaya gives one final flick with her back paw, pushing him off the limestone into the abyss.</w:t>
+      </w:r>
+    </w:p>
+    <w:p>
+      <w:r>
+        <w:lastRenderedPageBreak/>
+        <w:t>Jack regains his human form as he lands on something sharp at the bottom of the lake before gathering his feet under him and pushing off with his lungs burning for a breath. He breaks the surface of the lake, hair making it hard to get a breath before he manages to gasp and get air. He dunks his head back in an effort to part the wet curtain of hair covering his face and finally gets a deep breath of air. He’s just tall enough to stand shoulders and head above the water and grateful he did not get flicked another foot or so, where the depth more than doubles. He runs his hands over his face trying to clear his eyes. Just as he lowers his hands and his vision clears, he’s face to face with his sister. She puts one hand on his shoulder, locks her foot around his knee, and smiles sweetly at him, placing her hand on the top of his head. She begins to push him down applying pressure to his head and shoulder while her foot buckles his knee. He goes under not quite getting a full breath before he’s once again on the bottom of the lake, sitting on something sharp.</w:t>
+      </w:r>
+    </w:p>
+    <w:p>
+      <w:r>
+        <w:t xml:space="preserve">Jack looks up and sees that Lea is gone, wondering how long he should sit on the bottom when something tugs at his hair. He tries to pivot to see, but his hair swirls around him like a blanket of seaweed and he starts to panic. He once again pushes off the bottom and heads for the surface, remembering this time to exit face first to keep his hair off his face. He tries to straighten his head but something in his hair is pulling him back. He starts sliding backwards toward the drop-off, feeling the sand and mud piling at his heels. He digs his toes in and starts walking towards the shore next to the rocky outcrop, using his left hand to hold and tug on his hair and his right arm for balance. The tug is acting like an anchor, and the rocks are so slippery, he lowers to his hands and knees, crawling the rest of the way. Resting back on his legs, he reaches back with both hands, gathering his hair at the base of his neck and whipping it around in front of him to free him of the weight. There, with a smile on her face and a nod of </w:t>
       </w:r>
       <w:r>
         <w:rPr>
           <w:i/>
           <w:iCs/>
         </w:rPr>
-        <w:t xml:space="preserve"> she’s ticklish. Oh, this go</w:t>
-      </w:r>
-      <w:r>
-        <w:rPr>
-          <w:i/>
-          <w:iCs/>
-        </w:rPr>
-        <w:t>n</w:t>
-      </w:r>
-      <w:r>
-        <w:rPr>
-          <w:i/>
-          <w:iCs/>
-        </w:rPr>
-        <w:t>n</w:t>
-      </w:r>
-      <w:r>
-        <w:rPr>
-          <w:i/>
-          <w:iCs/>
-        </w:rPr>
-        <w:t>a</w:t>
-      </w:r>
-      <w:r>
-        <w:rPr>
-          <w:i/>
-          <w:iCs/>
-        </w:rPr>
-        <w:t xml:space="preserve"> be </w:t>
-      </w:r>
-      <w:proofErr w:type="spellStart"/>
-      <w:r>
-        <w:rPr>
-          <w:i/>
-          <w:iCs/>
-        </w:rPr>
-        <w:t>so</w:t>
-      </w:r>
-      <w:r>
-        <w:rPr>
-          <w:i/>
-          <w:iCs/>
-        </w:rPr>
-        <w:t>ooo</w:t>
-      </w:r>
-      <w:proofErr w:type="spellEnd"/>
-      <w:r>
-        <w:rPr>
-          <w:i/>
-          <w:iCs/>
-        </w:rPr>
-        <w:t xml:space="preserve"> good</w:t>
-      </w:r>
-      <w:r>
-        <w:t>, he thinks to himself.</w:t>
-      </w:r>
-    </w:p>
-    <w:p>
-      <w:r>
-        <w:rPr>
-          <w:i/>
-          <w:iCs/>
-        </w:rPr>
-        <w:t>Talon or beak? Beak</w:t>
-      </w:r>
-      <w:r>
-        <w:t>. Jack nods to himself with the decision and looks around her curled up legs to verify she is still asleep. He judges the distance and takes a small hop forward. He stretches his neck out so just the tip of his beak reaches the soles of her feet and quickly runs his beak up one and down the other, and then jumps back. Nothing. Not even a twitch. Socks are too thick. He walks slowly forward again and freezes midstep when he hears Kaya sloshing as she dog-paddles toward the cavern again. He has to move quickly before she returns. He takes a big hop and inches from Lea’s feet, when he runs the tip of his beak up the middle of the sole of her foot. He quietly thanks heaven these were not wool socks, which would snag his beak. Just as quickly, he runs his beak in the same maneuver, down her other sole just as Kaya enters the mouth of the cavern, water up to her belly, dripping and beginning to shake herself dry.</w:t>
-      </w:r>
-    </w:p>
-    <w:p>
-      <w:r>
-        <w:t xml:space="preserve">Lea is just settling back to sleep but still alert, making sure Kaya is not rummaging through the saddle bags for the last of her supplies since the market won’t be open today. She knows it’s probably late and she needs to get up but dozes back to sleep thinking, </w:t>
-      </w:r>
-      <w:r>
-        <w:rPr>
-          <w:i/>
-          <w:iCs/>
-        </w:rPr>
-        <w:t>T</w:t>
-      </w:r>
-      <w:r>
-        <w:rPr>
-          <w:i/>
-          <w:iCs/>
-        </w:rPr>
-        <w:t>en minutes more won’t hurt</w:t>
-      </w:r>
-      <w:r>
-        <w:t>. She feels something tug at her sock slightly but thinks she’s dreaming and settles back down. She is almost completely relaxed again when something runs up one sole of her foot and down the other in a move her father loved to perform on her to make her squeal and jump. Before it hits her fully what is happening, her body reacts and she kicks violently in the direction of whomever might be at her feet.</w:t>
-      </w:r>
-    </w:p>
-    <w:p>
-      <w:r>
-        <w:t xml:space="preserve">Jack is unprepared for her reaction. He has forgotten that Lea can kick like an army mule and he suddenly has one foot squarely in his chest, launching him toward the mouth of the cavern. He lands and bounces just near the spring and realizes he is about to collide with Kaya. She lowers her ears and growls at him, </w:t>
-      </w:r>
-      <w:proofErr w:type="gramStart"/>
-      <w:r>
-        <w:t>baring</w:t>
-      </w:r>
-      <w:proofErr w:type="gramEnd"/>
-      <w:r>
-        <w:t xml:space="preserve"> teeth. He has nowhere to go but right in them. He unfolds his wings and fans his tail hoping to create the flaps airplanes use to slow down. Jack lands between her front feet. Kaya looks down at him and out comes the sly grin again. He’s up to his neck in water and realizes he will have to change or drown to avoid what punishment Kaya is about to dole out. Kaya takes her front paw and flicks him to her back foot where he’s now struggling to stay above water. Kaya takes her back paw and dunks him the rest of the way under the water. Jack sputters and tries not to let the water fill his lungs as he slowly starts sliding on the slick limestone of the cavern entrance to the drop off to the bottom of the lake. Kaya gives one final flick with her back paw, pushing him off the limestone into the abyss.</w:t>
-      </w:r>
-    </w:p>
-    <w:p>
-      <w:r>
-        <w:lastRenderedPageBreak/>
-        <w:t>Jack regains his human form as he lands on something sharp at the bottom of the lake before gathering his feet under him and pushing off with his lungs burning for a breath. He breaks the surface of the lake, hair making it hard to get a breath before he manages to gasp and get air. He dunks his head back in an effort to part the wet curtain of hair covering his face and finally gets a deep breath of air. He’s just tall enough to stand shoulders and head above the water and grateful he did not get flicked another foot or so, where the depth more than doubles. He runs his hands over his face trying to clear his eyes. Just as he lowers his hands and his vision clears, he’s face to face with his sister. She puts one hand on his shoulder, locks her foot around his knee, and smiles sweetly at him, placing her hand on the top of his head. She begins to push him down applying pressure to his head and shoulder while her foot buckles his knee. He goes under not quite getting a full breath before he’s once again on the bottom of the lake, sitting on something sharp.</w:t>
-      </w:r>
-    </w:p>
-    <w:p>
-      <w:r>
-        <w:t xml:space="preserve">Jack looks up and sees that Lea is gone, wondering how long he should sit on the bottom when something tugs at his hair. He tries to pivot to see, but his hair swirls around him like a blanket of seaweed and he starts to panic. He once again pushes off the bottom and heads for the surface, remembering this time to exit face first to keep his hair off his face. He tries to straighten his head but something in his hair is pulling him back. He starts sliding backwards toward the drop-off, feeling the sand and mud piling at his heels. He digs his toes in and starts walking towards the shore next to the rocky outcrop, using his left hand to hold and tug on his hair and his right arm for balance. The tug is acting like an anchor, and the rocks are so slippery, he lowers to his hands and knees, crawling the rest of the way. Resting back on his legs, he reaches back with both hands, gathering his hair at the base of his neck and whipping it around in front of him to free him of the weight. There, with a smile on her face and a nod of </w:t>
-      </w:r>
-      <w:r>
-        <w:rPr>
-          <w:i/>
-          <w:iCs/>
-        </w:rPr>
-        <w:t>thank you</w:t>
-      </w:r>
-      <w:r>
-        <w:t>, is Kaya admiring the lake trout that was weighing him down.</w:t>
+        <w:t>thank you,</w:t>
+      </w:r>
+      <w:r>
+        <w:t xml:space="preserve"> is Kaya admiring the lake trout that was weighing him down.</w:t>
       </w:r>
     </w:p>
     <w:p>
@@ -405,10 +328,10 @@
           <w:i/>
           <w:iCs/>
         </w:rPr>
-        <w:t>do they even do that anymore</w:t>
-      </w:r>
-      <w:r>
-        <w:t>? She goes through the inventory of her wine cellar in Mama Bear’s cave when Jack comes back with fourteen eggs cradled in his shirt. She uses a steady flame in the campfire to candle them for chicks before handing two back to Jack. She breaks six into the bowl with the onion and deviled ham, adding canned milk to give the eggs a fluffy, light texture. Jack pivots to return the chick eggs back to their mothers, while Lea goes to the lake for her cooler to remove the butter and place the remaining eggs in there to keep them cool. She puts some butter in the skillet and on two pieces of bread before whisking the omelet mixture and adding it to the skillet.</w:t>
+        <w:t>do they even do that anymore?</w:t>
+      </w:r>
+      <w:r>
+        <w:t xml:space="preserve"> She goes through the inventory of her wine cellar in Mama Bear’s cave when Jack comes back with fourteen eggs cradled in his shirt. She uses a steady flame in the campfire to candle them for chicks before handing two back to Jack. She breaks six into the bowl with the onion and deviled ham, adding canned milk to give the eggs a fluffy, light texture. Jack pivots to return the chick eggs back to their mothers, while Lea goes to the lake for her cooler to remove the butter and place the remaining eggs in there to keep them cool. She puts some butter in the skillet and on two pieces of bread before whisking the omelet mixture and adding it to the skillet.</w:t>
       </w:r>
     </w:p>
     <w:p>
@@ -451,14 +374,6 @@
       </w:r>
     </w:p>
     <w:p>
-      <w:pPr>
-        <w:sectPr>
-          <w:pgSz w:w="12240" w:h="15840"/>
-          <w:pgMar w:top="1440" w:right="1440" w:bottom="1440" w:left="1440" w:header="720" w:footer="720" w:gutter="0"/>
-          <w:cols w:space="720"/>
-          <w:docGrid w:linePitch="360"/>
-        </w:sectPr>
-      </w:pPr>
       <w:r>
         <w:t>Lea and Jack make quick work of their lunch, gently trying to remind Kaya onions are bad for her as she tries every trick in her book to get a bite from one of them. They clean the dishes and check the campfire. Lea stops at what looks like a bench log and she reaches under the far edge and a hatch pops open in the seat. She retrieves her conch belt and puts it on, finishing the cowgirl look to his cowboy. They start off for the far end of the lake towards the ridge where Frank’s place lies.</w:t>
       </w:r>
@@ -874,7 +789,7 @@
   <w:style w:type="paragraph" w:default="1" w:styleId="Normal">
     <w:name w:val="Normal"/>
     <w:qFormat/>
-    <w:rsid w:val="00201B3B"/>
+    <w:rsid w:val="00577A8C"/>
     <w:pPr>
       <w:keepNext/>
       <w:keepLines/>
@@ -908,19 +823,19 @@
     <w:basedOn w:val="Normal"/>
     <w:next w:val="Normal"/>
     <w:link w:val="Heading2Char"/>
-    <w:uiPriority w:val="9"/>
-    <w:semiHidden/>
+    <w:autoRedefine/>
+    <w:uiPriority w:val="9"/>
     <w:unhideWhenUsed/>
     <w:qFormat/>
-    <w:rsid w:val="0051428B"/>
+    <w:rsid w:val="00577A8C"/>
     <w:pPr>
-      <w:spacing w:before="160" w:after="80"/>
+      <w:spacing w:after="240"/>
+      <w:jc w:val="center"/>
       <w:outlineLvl w:val="1"/>
     </w:pPr>
     <w:rPr>
       <w:rFonts w:eastAsiaTheme="majorEastAsia" w:cstheme="majorBidi"/>
-      <w:color w:val="365F91" w:themeColor="accent1" w:themeShade="BF"/>
-      <w:sz w:val="32"/>
+      <w:sz w:val="56"/>
       <w:szCs w:val="32"/>
     </w:rPr>
   </w:style>
@@ -1097,12 +1012,10 @@
     <w:basedOn w:val="DefaultParagraphFont"/>
     <w:link w:val="Heading2"/>
     <w:uiPriority w:val="9"/>
-    <w:semiHidden/>
-    <w:rsid w:val="0051428B"/>
+    <w:rsid w:val="00577A8C"/>
     <w:rPr>
       <w:rFonts w:ascii="Times New Roman" w:eastAsiaTheme="majorEastAsia" w:hAnsi="Times New Roman" w:cstheme="majorBidi"/>
-      <w:color w:val="365F91" w:themeColor="accent1" w:themeShade="BF"/>
-      <w:sz w:val="32"/>
+      <w:sz w:val="56"/>
       <w:szCs w:val="32"/>
     </w:rPr>
   </w:style>

</xml_diff>